<commit_message>
I finalized the immune analysis for the go on the mechanisms of hybrid male susceptibility
</commit_message>
<xml_diff>
--- a/results/tables/Ferreira_Complete_Dataset_Results/Ferreira_Complete_Dataset_Results.docx
+++ b/results/tables/Ferreira_Complete_Dataset_Results/Ferreira_Complete_Dataset_Results.docx
@@ -261,7 +261,7 @@
                 <w:rFonts w:ascii="Calibri" w:hAnsi="Calibri"/>
                 <w:sz w:val="20"/>
               </w:rPr>
-              <w:t xml:space="default">0.0028</w:t>
+              <w:t xml:space="default">0.0029</w:t>
             </w:r>
           </w:p>
         </w:tc>
@@ -285,7 +285,7 @@
                 <w:rFonts w:ascii="Calibri" w:hAnsi="Calibri"/>
                 <w:sz w:val="20"/>
               </w:rPr>
-              <w:t xml:space="default">(-0.0135, 0.0192)</w:t>
+              <w:t xml:space="default">(-0.0135, 0.0193)</w:t>
             </w:r>
           </w:p>
         </w:tc>
@@ -309,7 +309,7 @@
                 <w:rFonts w:ascii="Calibri" w:hAnsi="Calibri"/>
                 <w:sz w:val="20"/>
               </w:rPr>
-              <w:t xml:space="default">0.734</w:t>
+              <w:t xml:space="default">0.732</w:t>
             </w:r>
           </w:p>
         </w:tc>
@@ -386,7 +386,7 @@
                 <w:rFonts w:ascii="Calibri" w:hAnsi="Calibri"/>
                 <w:sz w:val="20"/>
               </w:rPr>
-              <w:t xml:space="default">0.0060</w:t>
+              <w:t xml:space="default">0.0221</w:t>
             </w:r>
           </w:p>
         </w:tc>
@@ -410,7 +410,7 @@
                 <w:rFonts w:ascii="Calibri" w:hAnsi="Calibri"/>
                 <w:sz w:val="20"/>
               </w:rPr>
-              <w:t xml:space="default">(-0.0199, 0.0320)</w:t>
+              <w:t xml:space="default">(-0.0039, 0.0481)</w:t>
             </w:r>
           </w:p>
         </w:tc>
@@ -434,7 +434,7 @@
                 <w:rFonts w:ascii="Calibri" w:hAnsi="Calibri"/>
                 <w:sz w:val="20"/>
               </w:rPr>
-              <w:t xml:space="default">0.649</w:t>
+              <w:t xml:space="default">0.095</w:t>
             </w:r>
           </w:p>
         </w:tc>
@@ -458,7 +458,7 @@
                 <w:rFonts w:ascii="Calibri" w:hAnsi="Calibri"/>
                 <w:sz w:val="20"/>
               </w:rPr>
-              <w:t xml:space="default"/>
+              <w:t xml:space="default">.</w:t>
             </w:r>
           </w:p>
         </w:tc>
@@ -475,6 +475,7 @@
               <w:start w:val="single" w:space="0" w:color="D3D3D3"/>
               <w:end w:val="single" w:space="0" w:color="D3D3D3"/>
             </w:tcBorders>
+            <w:shd w:val="clear" w:color="auto" w:fill="FFEBEE"/>
           </w:tcPr>
           <w:p>
             <w:pPr>
@@ -486,6 +487,7 @@
               <w:rPr>
                 <w:rFonts w:ascii="Calibri" w:hAnsi="Calibri"/>
                 <w:sz w:val="20"/>
+                <w:b w:val="true"/>
               </w:rPr>
               <w:t xml:space="default">Mean hybridization level</w:t>
             </w:r>
@@ -499,6 +501,7 @@
               <w:start w:val="single" w:space="0" w:color="D3D3D3"/>
               <w:end w:val="single" w:space="0" w:color="D3D3D3"/>
             </w:tcBorders>
+            <w:shd w:val="clear" w:color="auto" w:fill="FFEBEE"/>
           </w:tcPr>
           <w:p>
             <w:pPr>
@@ -510,19 +513,21 @@
               <w:rPr>
                 <w:rFonts w:ascii="Calibri" w:hAnsi="Calibri"/>
                 <w:sz w:val="20"/>
-              </w:rPr>
-              <w:t xml:space="default">-0.0117</w:t>
-            </w:r>
-          </w:p>
-        </w:tc>
-        <w:tc>
-          <w:tcPr>
-            <w:tcBorders>
-              <w:top w:val="single" w:space="0" w:color="D3D3D3"/>
-              <w:bottom w:val="single" w:space="0" w:color="D3D3D3"/>
-              <w:start w:val="single" w:space="0" w:color="D3D3D3"/>
-              <w:end w:val="single" w:space="0" w:color="D3D3D3"/>
-            </w:tcBorders>
+                <w:b w:val="true"/>
+              </w:rPr>
+              <w:t xml:space="default">-0.0301</w:t>
+            </w:r>
+          </w:p>
+        </w:tc>
+        <w:tc>
+          <w:tcPr>
+            <w:tcBorders>
+              <w:top w:val="single" w:space="0" w:color="D3D3D3"/>
+              <w:bottom w:val="single" w:space="0" w:color="D3D3D3"/>
+              <w:start w:val="single" w:space="0" w:color="D3D3D3"/>
+              <w:end w:val="single" w:space="0" w:color="D3D3D3"/>
+            </w:tcBorders>
+            <w:shd w:val="clear" w:color="auto" w:fill="FFEBEE"/>
           </w:tcPr>
           <w:p>
             <w:pPr>
@@ -534,19 +539,21 @@
               <w:rPr>
                 <w:rFonts w:ascii="Calibri" w:hAnsi="Calibri"/>
                 <w:sz w:val="20"/>
-              </w:rPr>
-              <w:t xml:space="default">(-0.0279, 0.0046)</w:t>
-            </w:r>
-          </w:p>
-        </w:tc>
-        <w:tc>
-          <w:tcPr>
-            <w:tcBorders>
-              <w:top w:val="single" w:space="0" w:color="D3D3D3"/>
-              <w:bottom w:val="single" w:space="0" w:color="D3D3D3"/>
-              <w:start w:val="single" w:space="0" w:color="D3D3D3"/>
-              <w:end w:val="single" w:space="0" w:color="D3D3D3"/>
-            </w:tcBorders>
+                <w:b w:val="true"/>
+              </w:rPr>
+              <w:t xml:space="default">(-0.0466, -0.0136)</w:t>
+            </w:r>
+          </w:p>
+        </w:tc>
+        <w:tc>
+          <w:tcPr>
+            <w:tcBorders>
+              <w:top w:val="single" w:space="0" w:color="D3D3D3"/>
+              <w:bottom w:val="single" w:space="0" w:color="D3D3D3"/>
+              <w:start w:val="single" w:space="0" w:color="D3D3D3"/>
+              <w:end w:val="single" w:space="0" w:color="D3D3D3"/>
+            </w:tcBorders>
+            <w:shd w:val="clear" w:color="auto" w:fill="FFEBEE"/>
           </w:tcPr>
           <w:p>
             <w:pPr>
@@ -558,19 +565,21 @@
               <w:rPr>
                 <w:rFonts w:ascii="Calibri" w:hAnsi="Calibri"/>
                 <w:sz w:val="20"/>
-              </w:rPr>
-              <w:t xml:space="default">0.158</w:t>
-            </w:r>
-          </w:p>
-        </w:tc>
-        <w:tc>
-          <w:tcPr>
-            <w:tcBorders>
-              <w:top w:val="single" w:space="0" w:color="D3D3D3"/>
-              <w:bottom w:val="single" w:space="0" w:color="D3D3D3"/>
-              <w:start w:val="single" w:space="0" w:color="D3D3D3"/>
-              <w:end w:val="single" w:space="0" w:color="D3D3D3"/>
-            </w:tcBorders>
+                <w:b w:val="true"/>
+              </w:rPr>
+              <w:t xml:space="default">&lt; 0.001</w:t>
+            </w:r>
+          </w:p>
+        </w:tc>
+        <w:tc>
+          <w:tcPr>
+            <w:tcBorders>
+              <w:top w:val="single" w:space="0" w:color="D3D3D3"/>
+              <w:bottom w:val="single" w:space="0" w:color="D3D3D3"/>
+              <w:start w:val="single" w:space="0" w:color="D3D3D3"/>
+              <w:end w:val="single" w:space="0" w:color="D3D3D3"/>
+            </w:tcBorders>
+            <w:shd w:val="clear" w:color="auto" w:fill="FFEBEE"/>
           </w:tcPr>
           <w:p>
             <w:pPr>
@@ -582,8 +591,9 @@
               <w:rPr>
                 <w:rFonts w:ascii="Calibri" w:hAnsi="Calibri"/>
                 <w:sz w:val="20"/>
-              </w:rPr>
-              <w:t xml:space="default"/>
+                <w:b w:val="true"/>
+              </w:rPr>
+              <w:t xml:space="default">***</w:t>
             </w:r>
           </w:p>
         </w:tc>
@@ -636,7 +646,7 @@
                 <w:rFonts w:ascii="Calibri" w:hAnsi="Calibri"/>
                 <w:sz w:val="20"/>
               </w:rPr>
-              <w:t xml:space="default">0.0030</w:t>
+              <w:t xml:space="default">0.0052</w:t>
             </w:r>
           </w:p>
         </w:tc>
@@ -660,7 +670,7 @@
                 <w:rFonts w:ascii="Calibri" w:hAnsi="Calibri"/>
                 <w:sz w:val="20"/>
               </w:rPr>
-              <w:t xml:space="default">(-0.0032, 0.0092)</w:t>
+              <w:t xml:space="default">(-0.0010, 0.0115)</w:t>
             </w:r>
           </w:p>
         </w:tc>
@@ -684,7 +694,7 @@
                 <w:rFonts w:ascii="Calibri" w:hAnsi="Calibri"/>
                 <w:sz w:val="20"/>
               </w:rPr>
-              <w:t xml:space="default">0.344</w:t>
+              <w:t xml:space="default">0.100</w:t>
             </w:r>
           </w:p>
         </w:tc>
@@ -708,7 +718,7 @@
                 <w:rFonts w:ascii="Calibri" w:hAnsi="Calibri"/>
                 <w:sz w:val="20"/>
               </w:rPr>
-              <w:t xml:space="default"/>
+              <w:t xml:space="default">.</w:t>
             </w:r>
           </w:p>
         </w:tc>
@@ -761,7 +771,7 @@
                 <w:rFonts w:ascii="Calibri" w:hAnsi="Calibri"/>
                 <w:sz w:val="20"/>
               </w:rPr>
-              <w:t xml:space="default">-0.0184</w:t>
+              <w:t xml:space="default">-0.0402</w:t>
             </w:r>
           </w:p>
         </w:tc>
@@ -785,7 +795,7 @@
                 <w:rFonts w:ascii="Calibri" w:hAnsi="Calibri"/>
                 <w:sz w:val="20"/>
               </w:rPr>
-              <w:t xml:space="default">(-0.0686, 0.0317)</w:t>
+              <w:t xml:space="default">(-0.0907, 0.0103)</w:t>
             </w:r>
           </w:p>
         </w:tc>
@@ -809,7 +819,7 @@
                 <w:rFonts w:ascii="Calibri" w:hAnsi="Calibri"/>
                 <w:sz w:val="20"/>
               </w:rPr>
-              <w:t xml:space="default">0.471</w:t>
+              <w:t xml:space="default">0.119</w:t>
             </w:r>
           </w:p>
         </w:tc>
@@ -890,7 +900,7 @@
                 <w:sz w:val="20"/>
                 <w:b w:val="true"/>
               </w:rPr>
-              <w:t xml:space="default">-0.0205</w:t>
+              <w:t xml:space="default">-0.0134</w:t>
             </w:r>
           </w:p>
         </w:tc>
@@ -916,7 +926,7 @@
                 <w:sz w:val="20"/>
                 <w:b w:val="true"/>
               </w:rPr>
-              <w:t xml:space="default">(-0.0268, -0.0143)</w:t>
+              <w:t xml:space="default">(-0.0196, -0.0072)</w:t>
             </w:r>
           </w:p>
         </w:tc>

</xml_diff>